<commit_message>
chore: ajoute le prompt projet mis à jour, l'extraction du document d'architecture et la vidéo motion design
Fichiers de travail laissés jusqu'ici hors des commits fonctionnels.

Co-Authored-By: Claude Sonnet 5 <noreply@anthropic.com>
</commit_message>
<xml_diff>
--- a/Prompt pour Lavage auto.docx
+++ b/Prompt pour Lavage auto.docx
@@ -1,6 +1,6 @@
 
 <file path=word/document.xml><?xml version="1.0" encoding="utf-8"?>
-<w:document xmlns:wpc="http://schemas.microsoft.com/office/word/2010/wordprocessingCanvas" xmlns:cx="http://schemas.microsoft.com/office/drawing/2014/chartex" xmlns:cx1="http://schemas.microsoft.com/office/drawing/2015/9/8/chartex" xmlns:cx2="http://schemas.microsoft.com/office/drawing/2015/10/21/chartex" xmlns:cx3="http://schemas.microsoft.com/office/drawing/2016/5/9/chartex" xmlns:cx4="http://schemas.microsoft.com/office/drawing/2016/5/10/chartex" xmlns:cx5="http://schemas.microsoft.com/office/drawing/2016/5/11/chartex" xmlns:cx6="http://schemas.microsoft.com/office/drawing/2016/5/12/chartex" xmlns:cx7="http://schemas.microsoft.com/office/drawing/2016/5/13/chartex" xmlns:cx8="http://schemas.microsoft.com/office/drawing/2016/5/14/chartex" xmlns:mc="http://schemas.openxmlformats.org/markup-compatibility/2006" xmlns:aink="http://schemas.microsoft.com/office/drawing/2016/ink" xmlns:am3d="http://schemas.microsoft.com/office/drawing/2017/model3d" xmlns:o="urn:schemas-microsoft-com:office:office" xmlns:oel="http://schemas.microsoft.com/office/2019/extlst" xmlns:r="http://schemas.openxmlformats.org/officeDocument/2006/relationships" xmlns:m="http://schemas.openxmlformats.org/officeDocument/2006/math" xmlns:v="urn:schemas-microsoft-com:vml" xmlns:wp14="http://schemas.microsoft.com/office/word/2010/wordprocessingDrawing" xmlns:wp="http://schemas.openxmlformats.org/drawingml/2006/wordprocessingDrawing" xmlns:w10="urn:schemas-microsoft-com:office:word" xmlns:w="http://schemas.openxmlformats.org/wordprocessingml/2006/main" xmlns:w14="http://schemas.microsoft.com/office/word/2010/wordml" xmlns:w15="http://schemas.microsoft.com/office/word/2012/wordml" xmlns:w16cei="http://schemas.microsoft.com/office/word/2026/wordml/cei" xmlns:w16cex="http://schemas.microsoft.com/office/word/2018/wordml/cex" xmlns:w16cid="http://schemas.microsoft.com/office/word/2016/wordml/cid" xmlns:w16="http://schemas.microsoft.com/office/word/2018/wordml" xmlns:w16du="http://schemas.microsoft.com/office/word/2023/wordml/word16du" xmlns:w16sdtdh="http://schemas.microsoft.com/office/word/2020/wordml/sdtdatahash" xmlns:w16sdtfl="http://schemas.microsoft.com/office/word/2024/wordml/sdtformatlock" xmlns:w16se="http://schemas.microsoft.com/office/word/2015/wordml/symex" xmlns:wpg="http://schemas.microsoft.com/office/word/2010/wordprocessingGroup" xmlns:wpi="http://schemas.microsoft.com/office/word/2010/wordprocessingInk" xmlns:wne="http://schemas.microsoft.com/office/word/2006/wordml" xmlns:wps="http://schemas.microsoft.com/office/word/2010/wordprocessingShape" mc:Ignorable="w14 w15 w16se w16cid w16 w16cex w16sdtdh w16sdtfl w16du wp14">
+<w:document xmlns:wpc="http://schemas.microsoft.com/office/word/2010/wordprocessingCanvas" xmlns:cx="http://schemas.microsoft.com/office/drawing/2014/chartex" xmlns:cx1="http://schemas.microsoft.com/office/drawing/2015/9/8/chartex" xmlns:cx2="http://schemas.microsoft.com/office/drawing/2015/10/21/chartex" xmlns:cx3="http://schemas.microsoft.com/office/drawing/2016/5/9/chartex" xmlns:cx4="http://schemas.microsoft.com/office/drawing/2016/5/10/chartex" xmlns:cx5="http://schemas.microsoft.com/office/drawing/2016/5/11/chartex" xmlns:cx6="http://schemas.microsoft.com/office/drawing/2016/5/12/chartex" xmlns:cx7="http://schemas.microsoft.com/office/drawing/2016/5/13/chartex" xmlns:cx8="http://schemas.microsoft.com/office/drawing/2016/5/14/chartex" xmlns:mc="http://schemas.openxmlformats.org/markup-compatibility/2006" xmlns:aink="http://schemas.microsoft.com/office/drawing/2016/ink" xmlns:am3d="http://schemas.microsoft.com/office/drawing/2017/model3d" xmlns:o="urn:schemas-microsoft-com:office:office" xmlns:oel="http://schemas.microsoft.com/office/2019/extlst" xmlns:r="http://schemas.openxmlformats.org/officeDocument/2006/relationships" xmlns:m="http://schemas.openxmlformats.org/officeDocument/2006/math" xmlns:v="urn:schemas-microsoft-com:vml" xmlns:wp14="http://schemas.microsoft.com/office/word/2010/wordprocessingDrawing" xmlns:wp="http://schemas.openxmlformats.org/drawingml/2006/wordprocessingDrawing" xmlns:w10="urn:schemas-microsoft-com:office:word" xmlns:w="http://schemas.openxmlformats.org/wordprocessingml/2006/main" xmlns:w14="http://schemas.microsoft.com/office/word/2010/wordml" xmlns:w15="http://schemas.microsoft.com/office/word/2012/wordml" xmlns:w16cex="http://schemas.microsoft.com/office/word/2018/wordml/cex" xmlns:w16cid="http://schemas.microsoft.com/office/word/2016/wordml/cid" xmlns:w16="http://schemas.microsoft.com/office/word/2018/wordml" xmlns:w16du="http://schemas.microsoft.com/office/word/2023/wordml/word16du" xmlns:w16sdtdh="http://schemas.microsoft.com/office/word/2020/wordml/sdtdatahash" xmlns:w16sdtfl="http://schemas.microsoft.com/office/word/2024/wordml/sdtformatlock" xmlns:w16se="http://schemas.microsoft.com/office/word/2015/wordml/symex" xmlns:wpg="http://schemas.microsoft.com/office/word/2010/wordprocessingGroup" xmlns:wpi="http://schemas.microsoft.com/office/word/2010/wordprocessingInk" xmlns:wne="http://schemas.microsoft.com/office/word/2006/wordml" xmlns:wps="http://schemas.microsoft.com/office/word/2010/wordprocessingShape" mc:Ignorable="w14 w15 w16se w16cid w16 w16cex w16sdtdh w16sdtfl w16du wp14">
   <w:body>
     <w:p>
       <w:r>
@@ -616,23 +616,7 @@
           <w:sz w:val="28"/>
           <w:szCs w:val="28"/>
         </w:rPr>
-        <w:t xml:space="preserve">Construire </w:t>
-      </w:r>
-      <w:proofErr w:type="gramStart"/>
-      <w:r>
-        <w:rPr>
-          <w:sz w:val="28"/>
-          <w:szCs w:val="28"/>
-        </w:rPr>
-        <w:t>le user</w:t>
-      </w:r>
-      <w:proofErr w:type="gramEnd"/>
-      <w:r>
-        <w:rPr>
-          <w:sz w:val="28"/>
-          <w:szCs w:val="28"/>
-        </w:rPr>
-        <w:t xml:space="preserve"> flow autour de cette fonctionnalité principale (définir une fois l’utilisateurs arrivent dans son SaaS qu’est-ce qu’il va voir quel chemin qu’il va prendre </w:t>
+        <w:t xml:space="preserve">Construire le user flow autour de cette fonctionnalité principale (définir une fois l’utilisateurs arrivent dans son SaaS qu’est-ce qu’il va voir quel chemin qu’il va prendre </w:t>
       </w:r>
     </w:p>
     <w:p>
@@ -1107,7 +1091,6 @@
         </w:rPr>
       </w:pPr>
       <w:proofErr w:type="spellStart"/>
-      <w:proofErr w:type="gramStart"/>
       <w:r>
         <w:rPr>
           <w:sz w:val="28"/>
@@ -1116,7 +1099,6 @@
         <w:t>utilsé</w:t>
       </w:r>
       <w:proofErr w:type="spellEnd"/>
-      <w:proofErr w:type="gramEnd"/>
       <w:r>
         <w:rPr>
           <w:sz w:val="28"/>
@@ -1125,7 +1107,6 @@
         <w:t xml:space="preserve"> </w:t>
       </w:r>
       <w:proofErr w:type="spellStart"/>
-      <w:proofErr w:type="gramStart"/>
       <w:r>
         <w:rPr>
           <w:sz w:val="28"/>
@@ -1150,7 +1131,6 @@
         <w:t>css</w:t>
       </w:r>
       <w:proofErr w:type="spellEnd"/>
-      <w:proofErr w:type="gramEnd"/>
       <w:r>
         <w:rPr>
           <w:sz w:val="28"/>
@@ -1278,23 +1258,7 @@
           <w:sz w:val="28"/>
           <w:szCs w:val="28"/>
         </w:rPr>
-        <w:t xml:space="preserve">Construire </w:t>
-      </w:r>
-      <w:proofErr w:type="gramStart"/>
-      <w:r>
-        <w:rPr>
-          <w:sz w:val="28"/>
-          <w:szCs w:val="28"/>
-        </w:rPr>
-        <w:t>le user</w:t>
-      </w:r>
-      <w:proofErr w:type="gramEnd"/>
-      <w:r>
-        <w:rPr>
-          <w:sz w:val="28"/>
-          <w:szCs w:val="28"/>
-        </w:rPr>
-        <w:t xml:space="preserve"> flow autour de cette fonctionnalité principale (définir une fois l’utilisateurs arrivent dans son SaaS qu’est-ce qu’il va voir quel chemin qu’il va prendre </w:t>
+        <w:t xml:space="preserve">Construire le user flow autour de cette fonctionnalité principale (définir une fois l’utilisateurs arrivent dans son SaaS qu’est-ce qu’il va voir quel chemin qu’il va prendre </w:t>
       </w:r>
     </w:p>
     <w:p>
@@ -1446,7 +1410,41 @@
           <w:sz w:val="28"/>
           <w:szCs w:val="28"/>
         </w:rPr>
-        <w:t xml:space="preserve">Mets en place une découverte progressive du reste du produit </w:t>
+        <w:t xml:space="preserve">Mets en place une découverte progressive du reste du </w:t>
+      </w:r>
+    </w:p>
+    <w:p>
+      <w:pPr>
+        <w:pStyle w:val="Paragraphedeliste"/>
+        <w:numPr>
+          <w:ilvl w:val="1"/>
+          <w:numId w:val="1"/>
+        </w:numPr>
+        <w:rPr>
+          <w:sz w:val="28"/>
+          <w:szCs w:val="28"/>
+        </w:rPr>
+      </w:pPr>
+    </w:p>
+    <w:p>
+      <w:pPr>
+        <w:pStyle w:val="Paragraphedeliste"/>
+        <w:numPr>
+          <w:ilvl w:val="1"/>
+          <w:numId w:val="1"/>
+        </w:numPr>
+        <w:rPr>
+          <w:sz w:val="28"/>
+          <w:szCs w:val="28"/>
+        </w:rPr>
+      </w:pPr>
+      <w:r>
+        <w:rPr>
+          <w:sz w:val="28"/>
+          <w:szCs w:val="28"/>
+        </w:rPr>
+        <w:lastRenderedPageBreak/>
+        <w:t xml:space="preserve">produit </w:t>
       </w:r>
     </w:p>
     <w:p>
@@ -1544,161 +1542,1176 @@
         <w:rPr>
           <w:color w:val="EE0000"/>
         </w:rPr>
-        <w:t xml:space="preserve"> for table "X" en créant [décris l'action, </w:t>
-      </w:r>
-      <w:proofErr w:type="gramStart"/>
+        <w:t xml:space="preserve"> for table "X" en créant [décris l'action, ex: une réservation]. On a déjà eu exactement ce problème sur la table stations (voir mémoire [[</w:t>
+      </w:r>
+      <w:proofErr w:type="spellStart"/>
       <w:r>
         <w:rPr>
           <w:color w:val="EE0000"/>
         </w:rPr>
-        <w:t>ex:</w:t>
-      </w:r>
-      <w:proofErr w:type="gramEnd"/>
+        <w:t>backend_migration</w:t>
+      </w:r>
+      <w:proofErr w:type="spellEnd"/>
       <w:r>
         <w:rPr>
           <w:color w:val="EE0000"/>
         </w:rPr>
-        <w:t xml:space="preserve"> une réservation]. On a déjà eu exactement ce problème sur la table stations (voir mémoire [[</w:t>
+        <w:t xml:space="preserve">]]) : le code fait .insert().select() pour récupérer la ligne tout juste créée, mais la règle de lecture (SELECT) de cette table dépend d'une donnée qui n'existe pas encore à cet instant précis (ex: un profil lié pas encore créé) — donc </w:t>
       </w:r>
       <w:proofErr w:type="spellStart"/>
       <w:r>
         <w:rPr>
           <w:color w:val="EE0000"/>
         </w:rPr>
-        <w:t>backend_migration</w:t>
+        <w:t>Postgres</w:t>
       </w:r>
       <w:proofErr w:type="spellEnd"/>
       <w:r>
         <w:rPr>
           <w:color w:val="EE0000"/>
         </w:rPr>
-        <w:t xml:space="preserve">]]) : le code </w:t>
-      </w:r>
-      <w:proofErr w:type="gramStart"/>
+        <w:t xml:space="preserve"> refuse de renvoyer la ligne et annule tout. Vérifie si c'est le même piège ici : ajoute une condition du type </w:t>
+      </w:r>
+      <w:proofErr w:type="spellStart"/>
       <w:r>
         <w:rPr>
           <w:color w:val="EE0000"/>
         </w:rPr>
-        <w:t>fait .insert</w:t>
-      </w:r>
-      <w:proofErr w:type="gramEnd"/>
+        <w:t>created_by</w:t>
+      </w:r>
+      <w:proofErr w:type="spellEnd"/>
       <w:r>
         <w:rPr>
           <w:color w:val="EE0000"/>
         </w:rPr>
-        <w:t>(</w:t>
-      </w:r>
-      <w:proofErr w:type="gramStart"/>
+        <w:t xml:space="preserve"> = </w:t>
+      </w:r>
+      <w:proofErr w:type="spellStart"/>
       <w:r>
         <w:rPr>
           <w:color w:val="EE0000"/>
         </w:rPr>
-        <w:t>).select</w:t>
-      </w:r>
-      <w:proofErr w:type="gramEnd"/>
+        <w:t>auth.uid</w:t>
+      </w:r>
+      <w:proofErr w:type="spellEnd"/>
       <w:r>
         <w:rPr>
           <w:color w:val="EE0000"/>
         </w:rPr>
-        <w:t>() pour récupérer la ligne tout juste créée, mais la règle de lecture (SELECT) de cette table dépend d'une donnée qui n'existe pas encore à cet instant précis (</w:t>
-      </w:r>
-      <w:proofErr w:type="gramStart"/>
+        <w:t xml:space="preserve">() (ou équivalent) à la </w:t>
+      </w:r>
+      <w:proofErr w:type="spellStart"/>
       <w:r>
         <w:rPr>
           <w:color w:val="EE0000"/>
         </w:rPr>
-        <w:t>ex:</w:t>
-      </w:r>
-      <w:proofErr w:type="gramEnd"/>
+        <w:t>policy</w:t>
+      </w:r>
+      <w:proofErr w:type="spellEnd"/>
       <w:r>
         <w:rPr>
           <w:color w:val="EE0000"/>
         </w:rPr>
-        <w:t xml:space="preserve"> un profil lié pas encore créé) — donc </w:t>
-      </w:r>
-      <w:proofErr w:type="spellStart"/>
-      <w:r>
+        <w:t xml:space="preserve"> SELECT de la table concernée pour que l'utilisateur puisse toujours voir ce qu'il vient lui-même de créer."</w:t>
+      </w:r>
+    </w:p>
+    <w:p>
+      <w:pPr>
         <w:rPr>
           <w:color w:val="EE0000"/>
         </w:rPr>
-        <w:t>Postgres</w:t>
-      </w:r>
-      <w:proofErr w:type="spellEnd"/>
-      <w:r>
+      </w:pPr>
+    </w:p>
+    <w:p>
+      <w:pPr>
         <w:rPr>
           <w:color w:val="EE0000"/>
         </w:rPr>
-        <w:t xml:space="preserve"> refuse de renvoyer la ligne et annule tout. Vérifie si c'est le même piège ici : ajoute une condition du type </w:t>
-      </w:r>
-      <w:proofErr w:type="spellStart"/>
+      </w:pPr>
       <w:r>
         <w:rPr>
           <w:color w:val="EE0000"/>
         </w:rPr>
-        <w:t>created_by</w:t>
-      </w:r>
-      <w:proofErr w:type="spellEnd"/>
-      <w:r>
+        <w:t>Je l'ai aussi noté dans la mémoire du projet, donc même sans ce prompt je vais naturellement vérifier ce piège en premier sur les prochains modules (réservations, transactions).</w:t>
+      </w:r>
+    </w:p>
+    <w:p/>
+    <w:p/>
+    <w:p/>
+    <w:p/>
+    <w:p>
+      <w:pPr>
         <w:rPr>
           <w:color w:val="EE0000"/>
         </w:rPr>
-        <w:t xml:space="preserve"> = </w:t>
-      </w:r>
-      <w:proofErr w:type="spellStart"/>
-      <w:proofErr w:type="gramStart"/>
-      <w:r>
-        <w:rPr>
-          <w:color w:val="EE0000"/>
-        </w:rPr>
-        <w:t>auth.uid</w:t>
-      </w:r>
-      <w:proofErr w:type="spellEnd"/>
-      <w:r>
-        <w:rPr>
-          <w:color w:val="EE0000"/>
-        </w:rPr>
-        <w:t>(</w:t>
-      </w:r>
-      <w:proofErr w:type="gramEnd"/>
-      <w:r>
-        <w:rPr>
-          <w:color w:val="EE0000"/>
-        </w:rPr>
-        <w:t xml:space="preserve">) (ou équivalent) à la </w:t>
-      </w:r>
-      <w:proofErr w:type="spellStart"/>
-      <w:r>
-        <w:rPr>
-          <w:color w:val="EE0000"/>
-        </w:rPr>
-        <w:t>policy</w:t>
-      </w:r>
-      <w:proofErr w:type="spellEnd"/>
-      <w:r>
-        <w:rPr>
-          <w:color w:val="EE0000"/>
-        </w:rPr>
-        <w:t xml:space="preserve"> SELECT de la table concernée pour que l'utilisateur puisse toujours voir ce qu'il vient lui-même de créer."</w:t>
-      </w:r>
-    </w:p>
-    <w:p>
-      <w:pPr>
-        <w:rPr>
-          <w:color w:val="EE0000"/>
-        </w:rPr>
-      </w:pPr>
-    </w:p>
-    <w:p>
-      <w:pPr>
-        <w:rPr>
-          <w:color w:val="EE0000"/>
-        </w:rPr>
-      </w:pPr>
-      <w:r>
-        <w:rPr>
-          <w:color w:val="EE0000"/>
-        </w:rPr>
-        <w:t>Je l'ai aussi noté dans la mémoire du projet, donc même sans ce prompt je vais naturellement vérifier ce piège en premier sur les prochains modules (réservations, transactions).</w:t>
+      </w:pPr>
+    </w:p>
+    <w:p>
+      <w:pPr>
+        <w:tabs>
+          <w:tab w:val="left" w:pos="1140"/>
+        </w:tabs>
+      </w:pPr>
+      <w:r>
+        <w:tab/>
+      </w:r>
+    </w:p>
+    <w:p>
+      <w:pPr>
+        <w:tabs>
+          <w:tab w:val="left" w:pos="1140"/>
+        </w:tabs>
+      </w:pPr>
+    </w:p>
+    <w:p>
+      <w:pPr>
+        <w:tabs>
+          <w:tab w:val="left" w:pos="1140"/>
+        </w:tabs>
+      </w:pPr>
+    </w:p>
+    <w:p>
+      <w:pPr>
+        <w:tabs>
+          <w:tab w:val="left" w:pos="1140"/>
+        </w:tabs>
+      </w:pPr>
+    </w:p>
+    <w:p>
+      <w:pPr>
+        <w:tabs>
+          <w:tab w:val="left" w:pos="1140"/>
+        </w:tabs>
+      </w:pPr>
+    </w:p>
+    <w:p>
+      <w:pPr>
+        <w:tabs>
+          <w:tab w:val="left" w:pos="1140"/>
+        </w:tabs>
+      </w:pPr>
+    </w:p>
+    <w:p>
+      <w:pPr>
+        <w:tabs>
+          <w:tab w:val="left" w:pos="1140"/>
+        </w:tabs>
+      </w:pPr>
+    </w:p>
+    <w:p>
+      <w:pPr>
+        <w:tabs>
+          <w:tab w:val="left" w:pos="1140"/>
+        </w:tabs>
+      </w:pPr>
+    </w:p>
+    <w:p>
+      <w:pPr>
+        <w:tabs>
+          <w:tab w:val="left" w:pos="1140"/>
+        </w:tabs>
+      </w:pPr>
+    </w:p>
+    <w:p>
+      <w:pPr>
+        <w:tabs>
+          <w:tab w:val="left" w:pos="1140"/>
+        </w:tabs>
+      </w:pPr>
+    </w:p>
+    <w:p>
+      <w:pPr>
+        <w:tabs>
+          <w:tab w:val="left" w:pos="1140"/>
+        </w:tabs>
+      </w:pPr>
+    </w:p>
+    <w:p>
+      <w:pPr>
+        <w:tabs>
+          <w:tab w:val="left" w:pos="1140"/>
+        </w:tabs>
+      </w:pPr>
+    </w:p>
+    <w:p>
+      <w:pPr>
+        <w:tabs>
+          <w:tab w:val="left" w:pos="1140"/>
+        </w:tabs>
+      </w:pPr>
+    </w:p>
+    <w:p>
+      <w:pPr>
+        <w:tabs>
+          <w:tab w:val="left" w:pos="1140"/>
+        </w:tabs>
+      </w:pPr>
+      <w:r>
+        <w:t xml:space="preserve">Contexte : je développe Clean Car Galsen, un SaaS de gestion du temps d'attente </w:t>
+      </w:r>
+    </w:p>
+    <w:p>
+      <w:pPr>
+        <w:tabs>
+          <w:tab w:val="left" w:pos="1140"/>
+        </w:tabs>
+      </w:pPr>
+      <w:r>
+        <w:t xml:space="preserve">pour stations de lavage auto au Sénégal (multi-stations). Les clients paient via </w:t>
+      </w:r>
+    </w:p>
+    <w:p>
+      <w:pPr>
+        <w:tabs>
+          <w:tab w:val="left" w:pos="1140"/>
+        </w:tabs>
+      </w:pPr>
+      <w:r>
+        <w:t xml:space="preserve">des liens de paiement </w:t>
+      </w:r>
+      <w:proofErr w:type="spellStart"/>
+      <w:r>
+        <w:t>PayDunya</w:t>
+      </w:r>
+      <w:proofErr w:type="spellEnd"/>
+      <w:r>
+        <w:t xml:space="preserve">, mais tous les paiements arrivent sur mon compte </w:t>
+      </w:r>
+    </w:p>
+    <w:p>
+      <w:pPr>
+        <w:tabs>
+          <w:tab w:val="left" w:pos="1140"/>
+        </w:tabs>
+      </w:pPr>
+      <w:proofErr w:type="spellStart"/>
+      <w:r>
+        <w:t>PayDunya</w:t>
+      </w:r>
+      <w:proofErr w:type="spellEnd"/>
+      <w:r>
+        <w:t xml:space="preserve"> unique. Je dois pouvoir tracer chaque paiement jusqu'à la station qui </w:t>
+      </w:r>
+    </w:p>
+    <w:p>
+      <w:pPr>
+        <w:tabs>
+          <w:tab w:val="left" w:pos="1140"/>
+        </w:tabs>
+      </w:pPr>
+      <w:r>
+        <w:t xml:space="preserve">l'a généré. Lancement prévu dans une semaine, le système doit être robuste et </w:t>
+      </w:r>
+    </w:p>
+    <w:p>
+      <w:pPr>
+        <w:tabs>
+          <w:tab w:val="left" w:pos="1140"/>
+        </w:tabs>
+      </w:pPr>
+      <w:r>
+        <w:t>prêt en production.</w:t>
+      </w:r>
+    </w:p>
+    <w:p>
+      <w:pPr>
+        <w:tabs>
+          <w:tab w:val="left" w:pos="1140"/>
+        </w:tabs>
+      </w:pPr>
+    </w:p>
+    <w:p>
+      <w:pPr>
+        <w:tabs>
+          <w:tab w:val="left" w:pos="1140"/>
+        </w:tabs>
+      </w:pPr>
+      <w:r>
+        <w:t>Mets en place le système suivant :</w:t>
+      </w:r>
+    </w:p>
+    <w:p>
+      <w:pPr>
+        <w:tabs>
+          <w:tab w:val="left" w:pos="1140"/>
+        </w:tabs>
+      </w:pPr>
+    </w:p>
+    <w:p>
+      <w:pPr>
+        <w:tabs>
+          <w:tab w:val="left" w:pos="1140"/>
+        </w:tabs>
+      </w:pPr>
+      <w:r>
+        <w:t>1. VARIABLES D'ENVIRONNEMENT</w:t>
+      </w:r>
+    </w:p>
+    <w:p>
+      <w:pPr>
+        <w:tabs>
+          <w:tab w:val="left" w:pos="1140"/>
+        </w:tabs>
+      </w:pPr>
+      <w:r>
+        <w:t xml:space="preserve">   - Crée/complète un fichier .</w:t>
+      </w:r>
+      <w:proofErr w:type="spellStart"/>
+      <w:r>
+        <w:t>env.example</w:t>
+      </w:r>
+      <w:proofErr w:type="spellEnd"/>
+      <w:r>
+        <w:t xml:space="preserve"> avec PAYDUNYA_MASTER_KEY, </w:t>
+      </w:r>
+    </w:p>
+    <w:p>
+      <w:pPr>
+        <w:tabs>
+          <w:tab w:val="left" w:pos="1140"/>
+        </w:tabs>
+      </w:pPr>
+      <w:r>
+        <w:t xml:space="preserve">     PAYDUNYA_PRIVATE_KEY, PAYDUNYA_TOKEN, PAYDUNYA_MODE (test/live)</w:t>
+      </w:r>
+    </w:p>
+    <w:p>
+      <w:pPr>
+        <w:tabs>
+          <w:tab w:val="left" w:pos="1140"/>
+        </w:tabs>
+      </w:pPr>
+      <w:r>
+        <w:t xml:space="preserve">   - Le code doit lire ces clés depuis les variables d'environnement, jamais en dur</w:t>
+      </w:r>
+    </w:p>
+    <w:p>
+      <w:pPr>
+        <w:tabs>
+          <w:tab w:val="left" w:pos="1140"/>
+        </w:tabs>
+      </w:pPr>
+      <w:r>
+        <w:t xml:space="preserve">   - Tant que les clés ne sont pas renseignées, le système doit rester en mode </w:t>
+      </w:r>
+    </w:p>
+    <w:p>
+      <w:pPr>
+        <w:tabs>
+          <w:tab w:val="left" w:pos="1140"/>
+        </w:tabs>
+      </w:pPr>
+      <w:r>
+        <w:t xml:space="preserve">     "non configuré" sans planter (afficher une erreur claire côté admin, pas </w:t>
+      </w:r>
+    </w:p>
+    <w:p>
+      <w:pPr>
+        <w:tabs>
+          <w:tab w:val="left" w:pos="1140"/>
+        </w:tabs>
+      </w:pPr>
+      <w:r>
+        <w:t xml:space="preserve">     côté client)</w:t>
+      </w:r>
+    </w:p>
+    <w:p>
+      <w:pPr>
+        <w:tabs>
+          <w:tab w:val="left" w:pos="1140"/>
+        </w:tabs>
+      </w:pPr>
+    </w:p>
+    <w:p>
+      <w:pPr>
+        <w:tabs>
+          <w:tab w:val="left" w:pos="1140"/>
+        </w:tabs>
+      </w:pPr>
+      <w:r>
+        <w:t>2. BASE DE DONNÉES</w:t>
+      </w:r>
+    </w:p>
+    <w:p>
+      <w:pPr>
+        <w:tabs>
+          <w:tab w:val="left" w:pos="1140"/>
+        </w:tabs>
+      </w:pPr>
+      <w:r>
+        <w:t xml:space="preserve">   - Crée une table/modèle "paiements" avec au minimum : id, </w:t>
+      </w:r>
+      <w:proofErr w:type="spellStart"/>
+      <w:r>
+        <w:t>station_id</w:t>
+      </w:r>
+      <w:proofErr w:type="spellEnd"/>
+      <w:r>
+        <w:t xml:space="preserve"> (FK), </w:t>
+      </w:r>
+    </w:p>
+    <w:p>
+      <w:pPr>
+        <w:tabs>
+          <w:tab w:val="left" w:pos="1140"/>
+        </w:tabs>
+      </w:pPr>
+      <w:r>
+        <w:t xml:space="preserve">     </w:t>
+      </w:r>
+      <w:proofErr w:type="spellStart"/>
+      <w:r>
+        <w:t>client_id</w:t>
+      </w:r>
+      <w:proofErr w:type="spellEnd"/>
+      <w:r>
+        <w:t xml:space="preserve"> (FK, </w:t>
+      </w:r>
+      <w:proofErr w:type="spellStart"/>
+      <w:r>
+        <w:t>nullable</w:t>
+      </w:r>
+      <w:proofErr w:type="spellEnd"/>
+      <w:r>
+        <w:t xml:space="preserve">), montant, </w:t>
+      </w:r>
+      <w:proofErr w:type="spellStart"/>
+      <w:r>
+        <w:t>token_unique</w:t>
+      </w:r>
+      <w:proofErr w:type="spellEnd"/>
+      <w:r>
+        <w:t xml:space="preserve"> (unique, indexé), </w:t>
+      </w:r>
+    </w:p>
+    <w:p>
+      <w:pPr>
+        <w:tabs>
+          <w:tab w:val="left" w:pos="1140"/>
+        </w:tabs>
+      </w:pPr>
+      <w:r>
+        <w:t xml:space="preserve">     statut (</w:t>
+      </w:r>
+      <w:proofErr w:type="spellStart"/>
+      <w:r>
+        <w:t>pending</w:t>
+      </w:r>
+      <w:proofErr w:type="spellEnd"/>
+      <w:r>
+        <w:t xml:space="preserve">/payé/échoué), </w:t>
+      </w:r>
+      <w:proofErr w:type="spellStart"/>
+      <w:r>
+        <w:t>created_at</w:t>
+      </w:r>
+      <w:proofErr w:type="spellEnd"/>
+      <w:r>
+        <w:t xml:space="preserve">, </w:t>
+      </w:r>
+      <w:proofErr w:type="spellStart"/>
+      <w:r>
+        <w:t>updated_at</w:t>
+      </w:r>
+      <w:proofErr w:type="spellEnd"/>
+      <w:r>
+        <w:t xml:space="preserve">, </w:t>
+      </w:r>
+      <w:proofErr w:type="spellStart"/>
+      <w:r>
+        <w:t>paydunya_invoice_token</w:t>
+      </w:r>
+      <w:proofErr w:type="spellEnd"/>
+    </w:p>
+    <w:p>
+      <w:pPr>
+        <w:tabs>
+          <w:tab w:val="left" w:pos="1140"/>
+        </w:tabs>
+      </w:pPr>
+      <w:r>
+        <w:t xml:space="preserve">   - Le </w:t>
+      </w:r>
+      <w:proofErr w:type="spellStart"/>
+      <w:r>
+        <w:t>token_unique</w:t>
+      </w:r>
+      <w:proofErr w:type="spellEnd"/>
+      <w:r>
+        <w:t xml:space="preserve"> doit être généré AVANT l'appel à </w:t>
+      </w:r>
+      <w:proofErr w:type="spellStart"/>
+      <w:r>
+        <w:t>PayDunya</w:t>
+      </w:r>
+      <w:proofErr w:type="spellEnd"/>
+      <w:r>
+        <w:t xml:space="preserve">, au format </w:t>
+      </w:r>
+    </w:p>
+    <w:p>
+      <w:pPr>
+        <w:tabs>
+          <w:tab w:val="left" w:pos="1140"/>
+        </w:tabs>
+      </w:pPr>
+      <w:r>
+        <w:t xml:space="preserve">     ST{</w:t>
+      </w:r>
+      <w:proofErr w:type="spellStart"/>
+      <w:r>
+        <w:t>station_id</w:t>
+      </w:r>
+      <w:proofErr w:type="spellEnd"/>
+      <w:r>
+        <w:t>}-{date}-{</w:t>
+      </w:r>
+      <w:proofErr w:type="spellStart"/>
+      <w:r>
+        <w:t>uuid</w:t>
+      </w:r>
+      <w:proofErr w:type="spellEnd"/>
+      <w:r>
+        <w:t xml:space="preserve"> court}</w:t>
+      </w:r>
+    </w:p>
+    <w:p>
+      <w:pPr>
+        <w:tabs>
+          <w:tab w:val="left" w:pos="1140"/>
+        </w:tabs>
+      </w:pPr>
+    </w:p>
+    <w:p>
+      <w:pPr>
+        <w:tabs>
+          <w:tab w:val="left" w:pos="1140"/>
+        </w:tabs>
+      </w:pPr>
+      <w:r>
+        <w:t>3. CRÉATION DU LIEN DE PAIEMENT</w:t>
+      </w:r>
+    </w:p>
+    <w:p>
+      <w:pPr>
+        <w:tabs>
+          <w:tab w:val="left" w:pos="1140"/>
+        </w:tabs>
+      </w:pPr>
+      <w:r>
+        <w:t xml:space="preserve">   - Fonction/</w:t>
+      </w:r>
+      <w:proofErr w:type="spellStart"/>
+      <w:r>
+        <w:t>endpoint</w:t>
+      </w:r>
+      <w:proofErr w:type="spellEnd"/>
+      <w:r>
+        <w:t xml:space="preserve"> qui : génère le </w:t>
+      </w:r>
+      <w:proofErr w:type="spellStart"/>
+      <w:r>
+        <w:t>token_unique</w:t>
+      </w:r>
+      <w:proofErr w:type="spellEnd"/>
+      <w:r>
+        <w:t xml:space="preserve">, crée l'enregistrement </w:t>
+      </w:r>
+    </w:p>
+    <w:p>
+      <w:pPr>
+        <w:tabs>
+          <w:tab w:val="left" w:pos="1140"/>
+        </w:tabs>
+      </w:pPr>
+      <w:r>
+        <w:t xml:space="preserve">     "</w:t>
+      </w:r>
+      <w:proofErr w:type="spellStart"/>
+      <w:r>
+        <w:t>pending</w:t>
+      </w:r>
+      <w:proofErr w:type="spellEnd"/>
+      <w:r>
+        <w:t xml:space="preserve">" en base, puis appelle l'API </w:t>
+      </w:r>
+      <w:proofErr w:type="spellStart"/>
+      <w:r>
+        <w:t>PayDunya</w:t>
+      </w:r>
+      <w:proofErr w:type="spellEnd"/>
+      <w:r>
+        <w:t xml:space="preserve"> (</w:t>
+      </w:r>
+      <w:proofErr w:type="spellStart"/>
+      <w:r>
+        <w:t>checkout-invoice</w:t>
+      </w:r>
+      <w:proofErr w:type="spellEnd"/>
+      <w:r>
+        <w:t>/</w:t>
+      </w:r>
+      <w:proofErr w:type="spellStart"/>
+      <w:r>
+        <w:t>create</w:t>
+      </w:r>
+      <w:proofErr w:type="spellEnd"/>
+      <w:r>
+        <w:t xml:space="preserve">) </w:t>
+      </w:r>
+    </w:p>
+    <w:p>
+      <w:pPr>
+        <w:tabs>
+          <w:tab w:val="left" w:pos="1140"/>
+        </w:tabs>
+      </w:pPr>
+      <w:r>
+        <w:lastRenderedPageBreak/>
+        <w:t xml:space="preserve">     en passant ce </w:t>
+      </w:r>
+      <w:proofErr w:type="spellStart"/>
+      <w:r>
+        <w:t>token</w:t>
+      </w:r>
+      <w:proofErr w:type="spellEnd"/>
+      <w:r>
+        <w:t xml:space="preserve"> dans le champ </w:t>
+      </w:r>
+      <w:proofErr w:type="spellStart"/>
+      <w:r>
+        <w:t>custom_data</w:t>
+      </w:r>
+      <w:proofErr w:type="spellEnd"/>
+      <w:r>
+        <w:t xml:space="preserve"> ET dans le champ de </w:t>
+      </w:r>
+    </w:p>
+    <w:p>
+      <w:pPr>
+        <w:tabs>
+          <w:tab w:val="left" w:pos="1140"/>
+        </w:tabs>
+      </w:pPr>
+      <w:r>
+        <w:t xml:space="preserve">     référence/</w:t>
+      </w:r>
+      <w:proofErr w:type="spellStart"/>
+      <w:r>
+        <w:t>callback_url</w:t>
+      </w:r>
+      <w:proofErr w:type="spellEnd"/>
+      <w:r>
+        <w:t xml:space="preserve"> pour double sécurité</w:t>
+      </w:r>
+    </w:p>
+    <w:p>
+      <w:pPr>
+        <w:tabs>
+          <w:tab w:val="left" w:pos="1140"/>
+        </w:tabs>
+      </w:pPr>
+      <w:r>
+        <w:t xml:space="preserve">   - Retourne l'URL de paiement </w:t>
+      </w:r>
+      <w:proofErr w:type="spellStart"/>
+      <w:r>
+        <w:t>PayDunya</w:t>
+      </w:r>
+      <w:proofErr w:type="spellEnd"/>
+      <w:r>
+        <w:t xml:space="preserve"> au frontend (ou l'affiche en QR code </w:t>
+      </w:r>
+    </w:p>
+    <w:p>
+      <w:pPr>
+        <w:tabs>
+          <w:tab w:val="left" w:pos="1140"/>
+        </w:tabs>
+      </w:pPr>
+      <w:r>
+        <w:t xml:space="preserve">     si le paiement se fait sur place, sur le téléphone du client en attente)</w:t>
+      </w:r>
+    </w:p>
+    <w:p>
+      <w:pPr>
+        <w:tabs>
+          <w:tab w:val="left" w:pos="1140"/>
+        </w:tabs>
+      </w:pPr>
+    </w:p>
+    <w:p>
+      <w:pPr>
+        <w:tabs>
+          <w:tab w:val="left" w:pos="1140"/>
+        </w:tabs>
+      </w:pPr>
+      <w:r>
+        <w:t>4. WEBHOOK / IPN</w:t>
+      </w:r>
+    </w:p>
+    <w:p>
+      <w:pPr>
+        <w:tabs>
+          <w:tab w:val="left" w:pos="1140"/>
+        </w:tabs>
+      </w:pPr>
+      <w:r>
+        <w:t xml:space="preserve">   - Endpoint POST qui reçoit la notification </w:t>
+      </w:r>
+      <w:proofErr w:type="spellStart"/>
+      <w:r>
+        <w:t>PayDunya</w:t>
+      </w:r>
+      <w:proofErr w:type="spellEnd"/>
+    </w:p>
+    <w:p>
+      <w:pPr>
+        <w:tabs>
+          <w:tab w:val="left" w:pos="1140"/>
+        </w:tabs>
+      </w:pPr>
+      <w:r>
+        <w:t xml:space="preserve">   - Vérifie la signature/authenticité de la requête (</w:t>
+      </w:r>
+      <w:proofErr w:type="spellStart"/>
+      <w:r>
+        <w:t>masterKey</w:t>
+      </w:r>
+      <w:proofErr w:type="spellEnd"/>
+      <w:r>
+        <w:t>) avant tout traitement</w:t>
+      </w:r>
+    </w:p>
+    <w:p>
+      <w:pPr>
+        <w:tabs>
+          <w:tab w:val="left" w:pos="1140"/>
+        </w:tabs>
+      </w:pPr>
+      <w:r>
+        <w:t xml:space="preserve">   - Extrait le </w:t>
+      </w:r>
+      <w:proofErr w:type="spellStart"/>
+      <w:r>
+        <w:t>token_unique</w:t>
+      </w:r>
+      <w:proofErr w:type="spellEnd"/>
+      <w:r>
+        <w:t xml:space="preserve"> reçu, retrouve le paiement "</w:t>
+      </w:r>
+      <w:proofErr w:type="spellStart"/>
+      <w:r>
+        <w:t>pending</w:t>
+      </w:r>
+      <w:proofErr w:type="spellEnd"/>
+      <w:r>
+        <w:t>" correspondant en base</w:t>
+      </w:r>
+    </w:p>
+    <w:p>
+      <w:pPr>
+        <w:tabs>
+          <w:tab w:val="left" w:pos="1140"/>
+        </w:tabs>
+      </w:pPr>
+      <w:r>
+        <w:t xml:space="preserve">   - Met à jour son statut selon la réponse </w:t>
+      </w:r>
+      <w:proofErr w:type="spellStart"/>
+      <w:r>
+        <w:t>PayDunya</w:t>
+      </w:r>
+      <w:proofErr w:type="spellEnd"/>
+      <w:r>
+        <w:t xml:space="preserve"> (</w:t>
+      </w:r>
+      <w:proofErr w:type="spellStart"/>
+      <w:r>
+        <w:t>completed</w:t>
+      </w:r>
+      <w:proofErr w:type="spellEnd"/>
+      <w:r>
+        <w:t>/</w:t>
+      </w:r>
+      <w:proofErr w:type="spellStart"/>
+      <w:r>
+        <w:t>failed</w:t>
+      </w:r>
+      <w:proofErr w:type="spellEnd"/>
+      <w:r>
+        <w:t>)</w:t>
+      </w:r>
+    </w:p>
+    <w:p>
+      <w:pPr>
+        <w:tabs>
+          <w:tab w:val="left" w:pos="1140"/>
+        </w:tabs>
+      </w:pPr>
+      <w:r>
+        <w:t xml:space="preserve">   - Déclenche l'attribution du paiement à la station (mise à jour du solde ou </w:t>
+      </w:r>
+    </w:p>
+    <w:p>
+      <w:pPr>
+        <w:tabs>
+          <w:tab w:val="left" w:pos="1140"/>
+        </w:tabs>
+      </w:pPr>
+      <w:r>
+        <w:t xml:space="preserve">     du tableau de bord de la station, et éventuellement passage du client au </w:t>
+      </w:r>
+    </w:p>
+    <w:p>
+      <w:pPr>
+        <w:tabs>
+          <w:tab w:val="left" w:pos="1140"/>
+        </w:tabs>
+      </w:pPr>
+      <w:r>
+        <w:t xml:space="preserve">     statut "en cours de lavage" si le paiement conditionne le lancement du service)</w:t>
+      </w:r>
+    </w:p>
+    <w:p>
+      <w:pPr>
+        <w:tabs>
+          <w:tab w:val="left" w:pos="1140"/>
+        </w:tabs>
+      </w:pPr>
+      <w:r>
+        <w:t xml:space="preserve">   - Répond avec le code HTTP attendu par </w:t>
+      </w:r>
+      <w:proofErr w:type="spellStart"/>
+      <w:r>
+        <w:t>PayDunya</w:t>
+      </w:r>
+      <w:proofErr w:type="spellEnd"/>
+      <w:r>
+        <w:t xml:space="preserve"> pour accuser réception</w:t>
+      </w:r>
+    </w:p>
+    <w:p>
+      <w:pPr>
+        <w:tabs>
+          <w:tab w:val="left" w:pos="1140"/>
+        </w:tabs>
+      </w:pPr>
+    </w:p>
+    <w:p>
+      <w:pPr>
+        <w:tabs>
+          <w:tab w:val="left" w:pos="1140"/>
+        </w:tabs>
+      </w:pPr>
+      <w:r>
+        <w:t>5. SÉCURITÉ ET FIABILITÉ</w:t>
+      </w:r>
+    </w:p>
+    <w:p>
+      <w:pPr>
+        <w:tabs>
+          <w:tab w:val="left" w:pos="1140"/>
+        </w:tabs>
+      </w:pPr>
+      <w:r>
+        <w:t xml:space="preserve">   - Le </w:t>
+      </w:r>
+      <w:proofErr w:type="spellStart"/>
+      <w:r>
+        <w:t>endpoint</w:t>
+      </w:r>
+      <w:proofErr w:type="spellEnd"/>
+      <w:r>
+        <w:t xml:space="preserve"> </w:t>
+      </w:r>
+      <w:proofErr w:type="spellStart"/>
+      <w:r>
+        <w:t>webhook</w:t>
+      </w:r>
+      <w:proofErr w:type="spellEnd"/>
+      <w:r>
+        <w:t xml:space="preserve"> doit être idempotent (si </w:t>
+      </w:r>
+      <w:proofErr w:type="spellStart"/>
+      <w:r>
+        <w:t>PayDunya</w:t>
+      </w:r>
+      <w:proofErr w:type="spellEnd"/>
+      <w:r>
+        <w:t xml:space="preserve"> renvoie la même </w:t>
+      </w:r>
+    </w:p>
+    <w:p>
+      <w:pPr>
+        <w:tabs>
+          <w:tab w:val="left" w:pos="1140"/>
+        </w:tabs>
+      </w:pPr>
+      <w:r>
+        <w:t xml:space="preserve">     notification deux fois, ne pas compter le paiement deux fois)</w:t>
+      </w:r>
+    </w:p>
+    <w:p>
+      <w:pPr>
+        <w:tabs>
+          <w:tab w:val="left" w:pos="1140"/>
+        </w:tabs>
+      </w:pPr>
+      <w:r>
+        <w:t xml:space="preserve">   - Logger chaque </w:t>
+      </w:r>
+      <w:proofErr w:type="spellStart"/>
+      <w:r>
+        <w:t>webhook</w:t>
+      </w:r>
+      <w:proofErr w:type="spellEnd"/>
+      <w:r>
+        <w:t xml:space="preserve"> reçu (</w:t>
+      </w:r>
+      <w:proofErr w:type="spellStart"/>
+      <w:r>
+        <w:t>payload</w:t>
+      </w:r>
+      <w:proofErr w:type="spellEnd"/>
+      <w:r>
+        <w:t xml:space="preserve"> brut) dans une table de logs, pour </w:t>
+      </w:r>
+    </w:p>
+    <w:p>
+      <w:pPr>
+        <w:tabs>
+          <w:tab w:val="left" w:pos="1140"/>
+        </w:tabs>
+      </w:pPr>
+      <w:r>
+        <w:t xml:space="preserve">     </w:t>
+      </w:r>
+      <w:proofErr w:type="spellStart"/>
+      <w:r>
+        <w:t>debug</w:t>
+      </w:r>
+      <w:proofErr w:type="spellEnd"/>
+      <w:r>
+        <w:t xml:space="preserve"> en cas de litige</w:t>
+      </w:r>
+    </w:p>
+    <w:p>
+      <w:pPr>
+        <w:tabs>
+          <w:tab w:val="left" w:pos="1140"/>
+        </w:tabs>
+      </w:pPr>
+      <w:r>
+        <w:t xml:space="preserve">   - Ajouter un mécanisme de vérification manuelle : un statut "</w:t>
+      </w:r>
+      <w:proofErr w:type="spellStart"/>
+      <w:r>
+        <w:t>pending</w:t>
+      </w:r>
+      <w:proofErr w:type="spellEnd"/>
+      <w:r>
+        <w:t xml:space="preserve">" resté </w:t>
+      </w:r>
+    </w:p>
+    <w:p>
+      <w:pPr>
+        <w:tabs>
+          <w:tab w:val="left" w:pos="1140"/>
+        </w:tabs>
+      </w:pPr>
+      <w:r>
+        <w:t xml:space="preserve">     trop longtemps (ex : plus de 15 minutes, cohérent avec un temps d'attente </w:t>
+      </w:r>
+    </w:p>
+    <w:p>
+      <w:pPr>
+        <w:tabs>
+          <w:tab w:val="left" w:pos="1140"/>
+        </w:tabs>
+      </w:pPr>
+      <w:r>
+        <w:t xml:space="preserve">     en station) doit être signalé, avec un </w:t>
+      </w:r>
+      <w:proofErr w:type="spellStart"/>
+      <w:r>
+        <w:t>endpoint</w:t>
+      </w:r>
+      <w:proofErr w:type="spellEnd"/>
+      <w:r>
+        <w:t xml:space="preserve"> ou tâche planifiée qui </w:t>
+      </w:r>
+    </w:p>
+    <w:p>
+      <w:pPr>
+        <w:tabs>
+          <w:tab w:val="left" w:pos="1140"/>
+        </w:tabs>
+      </w:pPr>
+      <w:r>
+        <w:t xml:space="preserve">     interroge l'API </w:t>
+      </w:r>
+      <w:proofErr w:type="spellStart"/>
+      <w:r>
+        <w:t>PayDunya</w:t>
+      </w:r>
+      <w:proofErr w:type="spellEnd"/>
+      <w:r>
+        <w:t xml:space="preserve"> pour vérifier le statut réel</w:t>
+      </w:r>
+    </w:p>
+    <w:p>
+      <w:pPr>
+        <w:tabs>
+          <w:tab w:val="left" w:pos="1140"/>
+        </w:tabs>
+      </w:pPr>
+    </w:p>
+    <w:p>
+      <w:pPr>
+        <w:tabs>
+          <w:tab w:val="left" w:pos="1140"/>
+        </w:tabs>
+      </w:pPr>
+      <w:r>
+        <w:t>6. TABLEAU DE BORD</w:t>
+      </w:r>
+    </w:p>
+    <w:p>
+      <w:pPr>
+        <w:tabs>
+          <w:tab w:val="left" w:pos="1140"/>
+        </w:tabs>
+      </w:pPr>
+      <w:r>
+        <w:t xml:space="preserve">   - Vue admin/station qui liste les paiements avec leur statut, filtrable par </w:t>
+      </w:r>
+    </w:p>
+    <w:p>
+      <w:pPr>
+        <w:tabs>
+          <w:tab w:val="left" w:pos="1140"/>
+        </w:tabs>
+      </w:pPr>
+      <w:r>
+        <w:t xml:space="preserve">     station, avec le montant total encaissé par station</w:t>
+      </w:r>
+    </w:p>
+    <w:p>
+      <w:pPr>
+        <w:tabs>
+          <w:tab w:val="left" w:pos="1140"/>
+        </w:tabs>
+      </w:pPr>
+    </w:p>
+    <w:p>
+      <w:pPr>
+        <w:tabs>
+          <w:tab w:val="left" w:pos="1140"/>
+        </w:tabs>
+      </w:pPr>
+      <w:r>
+        <w:t xml:space="preserve">Structure le code proprement (séparation service </w:t>
+      </w:r>
+      <w:proofErr w:type="spellStart"/>
+      <w:r>
+        <w:t>PayDunya</w:t>
+      </w:r>
+      <w:proofErr w:type="spellEnd"/>
+      <w:r>
+        <w:t xml:space="preserve"> / logique métier / </w:t>
+      </w:r>
+    </w:p>
+    <w:p>
+      <w:pPr>
+        <w:tabs>
+          <w:tab w:val="left" w:pos="1140"/>
+        </w:tabs>
+      </w:pPr>
+      <w:r>
+        <w:t xml:space="preserve">routes), commente les parties liées à la sécurité du </w:t>
+      </w:r>
+      <w:proofErr w:type="spellStart"/>
+      <w:r>
+        <w:t>webhook</w:t>
+      </w:r>
+      <w:proofErr w:type="spellEnd"/>
+      <w:r>
+        <w:t xml:space="preserve">, et laisse des </w:t>
+      </w:r>
+    </w:p>
+    <w:p>
+      <w:pPr>
+        <w:tabs>
+          <w:tab w:val="left" w:pos="1140"/>
+        </w:tabs>
+      </w:pPr>
+      <w:r>
+        <w:t xml:space="preserve">TODO clairs uniquement là où une décision métier reste à prendre. Priorité à </w:t>
+      </w:r>
+    </w:p>
+    <w:p>
+      <w:pPr>
+        <w:tabs>
+          <w:tab w:val="left" w:pos="1140"/>
+        </w:tabs>
+      </w:pPr>
+      <w:r>
+        <w:t xml:space="preserve">la fiabilité du </w:t>
+      </w:r>
+      <w:proofErr w:type="spellStart"/>
+      <w:r>
+        <w:t>webhook</w:t>
+      </w:r>
+      <w:proofErr w:type="spellEnd"/>
+      <w:r>
+        <w:t xml:space="preserve"> vu le lancement imminent : un paiement mal attribué en </w:t>
+      </w:r>
+    </w:p>
+    <w:p>
+      <w:pPr>
+        <w:tabs>
+          <w:tab w:val="left" w:pos="1140"/>
+        </w:tabs>
+      </w:pPr>
+      <w:r>
+        <w:t xml:space="preserve">station le jour du lancement serait critique. Dès que j'ajouterai mes vraies </w:t>
+      </w:r>
+    </w:p>
+    <w:p>
+      <w:pPr>
+        <w:tabs>
+          <w:tab w:val="left" w:pos="1140"/>
+        </w:tabs>
+      </w:pPr>
+      <w:r>
+        <w:t xml:space="preserve">clés </w:t>
+      </w:r>
+      <w:proofErr w:type="spellStart"/>
+      <w:r>
+        <w:t>PayDunya</w:t>
+      </w:r>
+      <w:proofErr w:type="spellEnd"/>
+      <w:r>
+        <w:t xml:space="preserve"> dans le .</w:t>
+      </w:r>
+      <w:proofErr w:type="spellStart"/>
+      <w:r>
+        <w:t>env</w:t>
+      </w:r>
+      <w:proofErr w:type="spellEnd"/>
+      <w:r>
+        <w:t xml:space="preserve">, le système doit fonctionner sans modification de </w:t>
+      </w:r>
+    </w:p>
+    <w:p>
+      <w:pPr>
+        <w:tabs>
+          <w:tab w:val="left" w:pos="1140"/>
+        </w:tabs>
+      </w:pPr>
+      <w:r>
+        <w:t>code supplémentaire.</w:t>
       </w:r>
     </w:p>
     <w:sectPr>
@@ -1712,7 +2725,7 @@
 </file>
 
 <file path=word/numbering.xml><?xml version="1.0" encoding="utf-8"?>
-<w:numbering xmlns:wpc="http://schemas.microsoft.com/office/word/2010/wordprocessingCanvas" xmlns:cx="http://schemas.microsoft.com/office/drawing/2014/chartex" xmlns:cx1="http://schemas.microsoft.com/office/drawing/2015/9/8/chartex" xmlns:cx2="http://schemas.microsoft.com/office/drawing/2015/10/21/chartex" xmlns:cx3="http://schemas.microsoft.com/office/drawing/2016/5/9/chartex" xmlns:cx4="http://schemas.microsoft.com/office/drawing/2016/5/10/chartex" xmlns:cx5="http://schemas.microsoft.com/office/drawing/2016/5/11/chartex" xmlns:cx6="http://schemas.microsoft.com/office/drawing/2016/5/12/chartex" xmlns:cx7="http://schemas.microsoft.com/office/drawing/2016/5/13/chartex" xmlns:cx8="http://schemas.microsoft.com/office/drawing/2016/5/14/chartex" xmlns:mc="http://schemas.openxmlformats.org/markup-compatibility/2006" xmlns:aink="http://schemas.microsoft.com/office/drawing/2016/ink" xmlns:am3d="http://schemas.microsoft.com/office/drawing/2017/model3d" xmlns:o="urn:schemas-microsoft-com:office:office" xmlns:oel="http://schemas.microsoft.com/office/2019/extlst" xmlns:r="http://schemas.openxmlformats.org/officeDocument/2006/relationships" xmlns:m="http://schemas.openxmlformats.org/officeDocument/2006/math" xmlns:v="urn:schemas-microsoft-com:vml" xmlns:wp14="http://schemas.microsoft.com/office/word/2010/wordprocessingDrawing" xmlns:wp="http://schemas.openxmlformats.org/drawingml/2006/wordprocessingDrawing" xmlns:w10="urn:schemas-microsoft-com:office:word" xmlns:w="http://schemas.openxmlformats.org/wordprocessingml/2006/main" xmlns:w14="http://schemas.microsoft.com/office/word/2010/wordml" xmlns:w15="http://schemas.microsoft.com/office/word/2012/wordml" xmlns:w16cei="http://schemas.microsoft.com/office/word/2026/wordml/cei" xmlns:w16cex="http://schemas.microsoft.com/office/word/2018/wordml/cex" xmlns:w16cid="http://schemas.microsoft.com/office/word/2016/wordml/cid" xmlns:w16="http://schemas.microsoft.com/office/word/2018/wordml" xmlns:w16du="http://schemas.microsoft.com/office/word/2023/wordml/word16du" xmlns:w16sdtdh="http://schemas.microsoft.com/office/word/2020/wordml/sdtdatahash" xmlns:w16sdtfl="http://schemas.microsoft.com/office/word/2024/wordml/sdtformatlock" xmlns:w16se="http://schemas.microsoft.com/office/word/2015/wordml/symex" xmlns:wpg="http://schemas.microsoft.com/office/word/2010/wordprocessingGroup" xmlns:wpi="http://schemas.microsoft.com/office/word/2010/wordprocessingInk" xmlns:wne="http://schemas.microsoft.com/office/word/2006/wordml" xmlns:wps="http://schemas.microsoft.com/office/word/2010/wordprocessingShape" mc:Ignorable="w14 w15 w16se w16cid w16 w16cex w16sdtdh w16sdtfl w16du wp14">
+<w:numbering xmlns:wpc="http://schemas.microsoft.com/office/word/2010/wordprocessingCanvas" xmlns:cx="http://schemas.microsoft.com/office/drawing/2014/chartex" xmlns:cx1="http://schemas.microsoft.com/office/drawing/2015/9/8/chartex" xmlns:cx2="http://schemas.microsoft.com/office/drawing/2015/10/21/chartex" xmlns:cx3="http://schemas.microsoft.com/office/drawing/2016/5/9/chartex" xmlns:cx4="http://schemas.microsoft.com/office/drawing/2016/5/10/chartex" xmlns:cx5="http://schemas.microsoft.com/office/drawing/2016/5/11/chartex" xmlns:cx6="http://schemas.microsoft.com/office/drawing/2016/5/12/chartex" xmlns:cx7="http://schemas.microsoft.com/office/drawing/2016/5/13/chartex" xmlns:cx8="http://schemas.microsoft.com/office/drawing/2016/5/14/chartex" xmlns:mc="http://schemas.openxmlformats.org/markup-compatibility/2006" xmlns:aink="http://schemas.microsoft.com/office/drawing/2016/ink" xmlns:am3d="http://schemas.microsoft.com/office/drawing/2017/model3d" xmlns:o="urn:schemas-microsoft-com:office:office" xmlns:oel="http://schemas.microsoft.com/office/2019/extlst" xmlns:r="http://schemas.openxmlformats.org/officeDocument/2006/relationships" xmlns:m="http://schemas.openxmlformats.org/officeDocument/2006/math" xmlns:v="urn:schemas-microsoft-com:vml" xmlns:wp14="http://schemas.microsoft.com/office/word/2010/wordprocessingDrawing" xmlns:wp="http://schemas.openxmlformats.org/drawingml/2006/wordprocessingDrawing" xmlns:w10="urn:schemas-microsoft-com:office:word" xmlns:w="http://schemas.openxmlformats.org/wordprocessingml/2006/main" xmlns:w14="http://schemas.microsoft.com/office/word/2010/wordml" xmlns:w15="http://schemas.microsoft.com/office/word/2012/wordml" xmlns:w16cex="http://schemas.microsoft.com/office/word/2018/wordml/cex" xmlns:w16cid="http://schemas.microsoft.com/office/word/2016/wordml/cid" xmlns:w16="http://schemas.microsoft.com/office/word/2018/wordml" xmlns:w16du="http://schemas.microsoft.com/office/word/2023/wordml/word16du" xmlns:w16sdtdh="http://schemas.microsoft.com/office/word/2020/wordml/sdtdatahash" xmlns:w16sdtfl="http://schemas.microsoft.com/office/word/2024/wordml/sdtformatlock" xmlns:w16se="http://schemas.microsoft.com/office/word/2015/wordml/symex" xmlns:wpg="http://schemas.microsoft.com/office/word/2010/wordprocessingGroup" xmlns:wpi="http://schemas.microsoft.com/office/word/2010/wordprocessingInk" xmlns:wne="http://schemas.microsoft.com/office/word/2006/wordml" xmlns:wps="http://schemas.microsoft.com/office/word/2010/wordprocessingShape" mc:Ignorable="w14 w15 w16se w16cid w16 w16cex w16sdtdh w16sdtfl w16du wp14">
   <w:abstractNum w:abstractNumId="0" w15:restartNumberingAfterBreak="0">
     <w:nsid w:val="5721567F"/>
     <w:multiLevelType w:val="multilevel"/>

</xml_diff>